<commit_message>
Finaliza 56 slides e 28 stories com pacotes e indice de publicacao
</commit_message>
<xml_diff>
--- a/conteudo/topo-de-funil/roteiros-e-prompts.docx
+++ b/conteudo/topo-de-funil/roteiros-e-prompts.docx
@@ -2125,6 +2125,24 @@
         <w:br/>
         <w:br/>
         <w:t>#AutocuidadoEspiritual #EspiritualidadeNoCotidiano #Presenca #SeresMultidimensionais #IntencaoDaSemana</w:t>
+      </w:r>
+    </w:p>
+    <w:p>
+      <w:r>
+        <w:br w:type="page"/>
+      </w:r>
+    </w:p>
+    <w:p>
+      <w:pPr>
+        <w:pStyle w:val="Heading1"/>
+      </w:pPr>
+      <w:r>
+        <w:t>Entrega final e publicação</w:t>
+      </w:r>
+    </w:p>
+    <w:p>
+      <w:r>
+        <w:t>Série exportada: 56 slides de carrossel e 28 cards de stories. Datas e horários em aberto. Nenhuma postagem publicada. Os stories prontos estão em stories-png de cada dia; os roteiros anteriores permanecem como alternativas para gravação pessoal. Adicione stickers no Instagram. Fotos de Ray e envio do e-book ao Drive continuam pendentes.</w:t>
       </w:r>
     </w:p>
     <w:sectPr>

</xml_diff>